<commit_message>
Refine doc review flow and reporting outputs
Reworks the weekly doc review process to treat deploy-triggered refresh as the primary automatic path and keep the workflow file as manual/on-demand only. The script now writes an always-current `DOCS_TO_UPDATE.md` snapshot, appends the full report to GitHub Actions step summaries, and expands doc-flag rules so `How to Setup.docx` is flagged when setup markdown or `deploy.yml` changes. Documentation pages were updated to match the new trigger model and review workflow, and `How to Setup.docx` was refreshed.
</commit_message>
<xml_diff>
--- a/Documentations/How to Setup.docx
+++ b/Documentations/How to Setup.docx
@@ -35,7 +35,7 @@
           <w:i/>
           <w:sz w:val="22"/>
         </w:rPr>
-        <w:t>Consolidated setup guide — dev-deploy-shafik-2</w:t>
+        <w:t>Consolidated setup guide</w:t>
       </w:r>
     </w:p>
     <w:p>
@@ -787,7 +787,7 @@
               <w:rPr>
                 <w:sz w:val="19"/>
               </w:rPr>
-              <w:t>nyunt/integration_N, shafik_nyunt_2_integration, dev-deploy-shafik-2</w:t>
+              <w:t>nyunt/integration_N, shafik_nyunt_2_integration</w:t>
             </w:r>
           </w:p>
         </w:tc>
@@ -1212,6 +1212,28 @@
           </w:p>
         </w:tc>
       </w:tr>
+      <w:tr>
+        <w:tc>
+          <w:tcPr>
+            <w:tcW w:type="dxa" w:w="3476"/>
+          </w:tcPr>
+          <w:p>
+            <w:r>
+              <w:t>How AutoTest Results / audit data stay current</w:t>
+            </w:r>
+          </w:p>
+        </w:tc>
+        <w:tc>
+          <w:tcPr>
+            <w:tcW w:type="dxa" w:w="5380"/>
+          </w:tcPr>
+          <w:p>
+            <w:r>
+              <w:t>Documentations/WEEKLY_DOC_REVIEW.md</w:t>
+            </w:r>
+          </w:p>
+        </w:tc>
+      </w:tr>
     </w:tbl>
     <w:p>
       <w:pPr>
@@ -1347,7 +1369,7 @@
               <w:rPr>
                 <w:sz w:val="19"/>
               </w:rPr>
-              <w:t>dev-deploy-shafik-2</w:t>
+              <w:t>dev-deploy-documentation (branch this doc is maintained on)</w:t>
             </w:r>
           </w:p>
         </w:tc>
@@ -1375,7 +1397,7 @@
               <w:rPr>
                 <w:sz w:val="19"/>
               </w:rPr>
-              <w:t>24 July 2026</w:t>
+              <w:t>7 August 2026</w:t>
             </w:r>
           </w:p>
         </w:tc>

</xml_diff>